<commit_message>
Add missing contract fields: znizenie_dni/cena, dodatocna_provizia
Co-Authored-By: Claude Sonnet 4.6 <noreply@anthropic.com>
</commit_message>
<xml_diff>
--- a/public/templates/vyhradna-zmluva-template.docx
+++ b/public/templates/vyhradna-zmluva-template.docx
@@ -2954,14 +2954,14 @@
           <w:rFonts w:cs="Times New Roman"/>
           <w:color w:val="000000"/>
         </w:rPr>
-        <w:t>v prípade, že sa Sprostredkovateľovi nepodarí uzatvoriť Rezervačnú zmluvu s akoukoľvek treťou osobou za podmienok dohodnutých v tejto Zmluve do ….. dní od uzatvorenia tejto Zmluvy, je Sprostredkovateľ oprávnený a Záujemca s tým súhlasí, znížiť cenu popísanú v bode a. tohto bodu Zmluvy o </w:t>
+        <w:t>v prípade, že sa Sprostredkovateľovi nepodarí uzatvoriť Rezervačnú zmluvu s akoukoľvek treťou osobou za podmienok dohodnutých v tejto Zmluve do {znizenie_dni} dní od uzatvorenia tejto Zmluvy, je Sprostredkovateľ oprávnený a Záujemca s tým súhlasí, znížiť cenu popísanú v bode a. tohto bodu Zmluvy o </w:t>
       </w:r>
       <w:r>
         <w:rPr>
           <w:rFonts w:eastAsia="Times New Roman" w:cs="Times New Roman"/>
           <w:color w:val="000000"/>
         </w:rPr>
-        <w:t>.........................,- EUR s tým, že takto znížená cena bude predstavovať minimálnu sumu, ktorá má byť po odpočítaní Provízie a Dodatočnej provízie vyplatená Záujemcovi na základe Sprostredkúvanej zmluvy,</w:t>
+        <w:t>{znizenie_cena},- EUR s tým, že takto znížená cena bude predstavovať minimálnu sumu, ktorá má byť po odpočítaní Provízie a Dodatočnej provízie vyplatená Záujemcovi na základe Sprostredkúvanej zmluvy,</w:t>
       </w:r>
     </w:p>
     <w:p>
@@ -3325,7 +3325,7 @@
         <w:rPr>
           <w:color w:val="000000"/>
         </w:rPr>
-        <w:t>V prípade, ak Sprostredkovateľ sprostredkuje uzatvorenie Sprostredkúvanej zmluvy za vyššiu Kúpnu cenu ako je súčet Požadovanej ceny a Provízie, Sprostredkovateľ má nárok na Dodatočnú províziu, ktorej výška sa určí ako ............................ rozdielu Kúpnej ceny a súčtu Požadovanej ceny a Provízie.</w:t>
+        <w:t>V prípade, ak Sprostredkovateľ sprostredkuje uzatvorenie Sprostredkúvanej zmluvy za vyššiu Kúpnu cenu ako je súčet Požadovanej ceny a Provízie, Sprostredkovateľ má nárok na Dodatočnú províziu, ktorej výška sa určí ako {dodatocna_provizia} rozdielu Kúpnej ceny a súčtu Požadovanej ceny a Provízie.</w:t>
       </w:r>
       <w:bookmarkStart w:id="0" w:name="_Hlk196831157"/>
       <w:bookmarkEnd w:id="0"/>

</xml_diff>

<commit_message>
Fix klient query, add z1-z6 owners with bytom from LV, auto number-to-words
Co-Authored-By: Claude Sonnet 4.6 <noreply@anthropic.com>
</commit_message>
<xml_diff>
--- a/public/templates/vyhradna-zmluva-template.docx
+++ b/public/templates/vyhradna-zmluva-template.docx
@@ -715,6 +715,381 @@
           <w:szCs w:val="24"/>
         </w:rPr>
         <w:t xml:space="preserve">                         {z3_kontakt}</w:t>
+      </w:r>
+    </w:p>
+    <w:p>
+      <w:pPr>
+        <w:pStyle w:val="NoSpacing"/>
+        <w:jc w:val="both"/>
+        <w:rPr/>
+      </w:pPr>
+      <w:r>
+        <w:rPr>
+          <w:rFonts w:ascii="Times New Roman" w:hAnsi="Times New Roman"/>
+          <w:b/>
+          <w:szCs w:val="24"/>
+        </w:rPr>
+        <w:t>Záujemca:</w:t>
+        <w:tab/>
+        <w:tab/>
+        <w:tab/>
+      </w:r>
+      <w:r>
+        <w:rPr>
+          <w:rFonts w:ascii="Times New Roman" w:hAnsi="Times New Roman"/>
+          <w:szCs w:val="24"/>
+        </w:rPr>
+        <w:t>{z4_meno}</w:t>
+      </w:r>
+    </w:p>
+    <w:p>
+      <w:pPr>
+        <w:pStyle w:val="NoSpacing"/>
+        <w:ind w:hanging="2124" w:left="2124"/>
+        <w:jc w:val="both"/>
+        <w:rPr/>
+      </w:pPr>
+      <w:r>
+        <w:rPr>
+          <w:rFonts w:ascii="Times New Roman" w:hAnsi="Times New Roman"/>
+          <w:b/>
+          <w:szCs w:val="24"/>
+        </w:rPr>
+        <w:t>Dátum narodenia:</w:t>
+        <w:tab/>
+        <w:t xml:space="preserve"> </w:t>
+        <w:tab/>
+      </w:r>
+      <w:r>
+        <w:rPr>
+          <w:rFonts w:ascii="Times New Roman" w:hAnsi="Times New Roman"/>
+          <w:szCs w:val="24"/>
+        </w:rPr>
+        <w:t>{z4_datum_nar}</w:t>
+      </w:r>
+    </w:p>
+    <w:p>
+      <w:pPr>
+        <w:pStyle w:val="NoSpacing"/>
+        <w:jc w:val="both"/>
+        <w:rPr/>
+      </w:pPr>
+      <w:r>
+        <w:rPr>
+          <w:rFonts w:ascii="Times New Roman" w:hAnsi="Times New Roman"/>
+          <w:b/>
+          <w:szCs w:val="24"/>
+        </w:rPr>
+        <w:t>Rodné číslo:</w:t>
+        <w:tab/>
+        <w:tab/>
+        <w:tab/>
+      </w:r>
+      <w:r>
+        <w:rPr>
+          <w:rFonts w:ascii="Times New Roman" w:hAnsi="Times New Roman"/>
+          <w:szCs w:val="24"/>
+        </w:rPr>
+        <w:t>{z4_rodne_cislo}</w:t>
+      </w:r>
+    </w:p>
+    <w:p>
+      <w:pPr>
+        <w:pStyle w:val="NoSpacing"/>
+        <w:ind w:hanging="2124" w:left="2124"/>
+        <w:jc w:val="both"/>
+        <w:rPr/>
+      </w:pPr>
+      <w:r>
+        <w:rPr>
+          <w:rFonts w:ascii="Times New Roman" w:hAnsi="Times New Roman"/>
+          <w:b/>
+          <w:szCs w:val="24"/>
+        </w:rPr>
+        <w:t xml:space="preserve">Bytom: </w:t>
+        <w:tab/>
+        <w:t xml:space="preserve"> </w:t>
+        <w:tab/>
+      </w:r>
+      <w:r>
+        <w:rPr>
+          <w:rFonts w:ascii="Times New Roman" w:hAnsi="Times New Roman"/>
+          <w:szCs w:val="24"/>
+        </w:rPr>
+        <w:t>{z4_bytom}</w:t>
+      </w:r>
+    </w:p>
+    <w:p>
+      <w:pPr>
+        <w:pStyle w:val="NoSpacing"/>
+        <w:ind w:hanging="2124" w:left="2124"/>
+        <w:jc w:val="both"/>
+        <w:rPr/>
+      </w:pPr>
+      <w:r>
+        <w:rPr>
+          <w:rFonts w:ascii="Times New Roman" w:hAnsi="Times New Roman"/>
+          <w:b/>
+          <w:szCs w:val="24"/>
+        </w:rPr>
+        <w:t>Mail, telefón:</w:t>
+      </w:r>
+      <w:r>
+        <w:rPr>
+          <w:rFonts w:ascii="Times New Roman" w:hAnsi="Times New Roman"/>
+          <w:szCs w:val="24"/>
+        </w:rPr>
+        <w:t xml:space="preserve">                         {z4_kontakt}</w:t>
+      </w:r>
+    </w:p>
+    <w:p>
+      <w:pPr>
+        <w:pStyle w:val="NoSpacing"/>
+        <w:jc w:val="both"/>
+        <w:rPr/>
+      </w:pPr>
+      <w:r>
+        <w:rPr>
+          <w:rFonts w:ascii="Times New Roman" w:hAnsi="Times New Roman"/>
+          <w:b/>
+          <w:szCs w:val="24"/>
+        </w:rPr>
+        <w:t>Záujemca:</w:t>
+        <w:tab/>
+        <w:tab/>
+        <w:tab/>
+      </w:r>
+      <w:r>
+        <w:rPr>
+          <w:rFonts w:ascii="Times New Roman" w:hAnsi="Times New Roman"/>
+          <w:szCs w:val="24"/>
+        </w:rPr>
+        <w:t>{z5_meno}</w:t>
+      </w:r>
+    </w:p>
+    <w:p>
+      <w:pPr>
+        <w:pStyle w:val="NoSpacing"/>
+        <w:ind w:hanging="2124" w:left="2124"/>
+        <w:jc w:val="both"/>
+        <w:rPr/>
+      </w:pPr>
+      <w:r>
+        <w:rPr>
+          <w:rFonts w:ascii="Times New Roman" w:hAnsi="Times New Roman"/>
+          <w:b/>
+          <w:szCs w:val="24"/>
+        </w:rPr>
+        <w:t>Dátum narodenia:</w:t>
+        <w:tab/>
+        <w:t xml:space="preserve"> </w:t>
+        <w:tab/>
+      </w:r>
+      <w:r>
+        <w:rPr>
+          <w:rFonts w:ascii="Times New Roman" w:hAnsi="Times New Roman"/>
+          <w:szCs w:val="24"/>
+        </w:rPr>
+        <w:t>{z5_datum_nar}</w:t>
+      </w:r>
+    </w:p>
+    <w:p>
+      <w:pPr>
+        <w:pStyle w:val="NoSpacing"/>
+        <w:jc w:val="both"/>
+        <w:rPr/>
+      </w:pPr>
+      <w:r>
+        <w:rPr>
+          <w:rFonts w:ascii="Times New Roman" w:hAnsi="Times New Roman"/>
+          <w:b/>
+          <w:szCs w:val="24"/>
+        </w:rPr>
+        <w:t>Rodné číslo:</w:t>
+        <w:tab/>
+        <w:tab/>
+        <w:tab/>
+      </w:r>
+      <w:r>
+        <w:rPr>
+          <w:rFonts w:ascii="Times New Roman" w:hAnsi="Times New Roman"/>
+          <w:szCs w:val="24"/>
+        </w:rPr>
+        <w:t>{z5_rodne_cislo}</w:t>
+      </w:r>
+    </w:p>
+    <w:p>
+      <w:pPr>
+        <w:pStyle w:val="NoSpacing"/>
+        <w:ind w:hanging="2124" w:left="2124"/>
+        <w:jc w:val="both"/>
+        <w:rPr/>
+      </w:pPr>
+      <w:r>
+        <w:rPr>
+          <w:rFonts w:ascii="Times New Roman" w:hAnsi="Times New Roman"/>
+          <w:b/>
+          <w:szCs w:val="24"/>
+        </w:rPr>
+        <w:t xml:space="preserve">Bytom: </w:t>
+        <w:tab/>
+        <w:t xml:space="preserve"> </w:t>
+        <w:tab/>
+      </w:r>
+      <w:r>
+        <w:rPr>
+          <w:rFonts w:ascii="Times New Roman" w:hAnsi="Times New Roman"/>
+          <w:szCs w:val="24"/>
+        </w:rPr>
+        <w:t>{z5_bytom}</w:t>
+      </w:r>
+    </w:p>
+    <w:p>
+      <w:pPr>
+        <w:pStyle w:val="NoSpacing"/>
+        <w:ind w:hanging="2124" w:left="2124"/>
+        <w:jc w:val="both"/>
+        <w:rPr/>
+      </w:pPr>
+      <w:r>
+        <w:rPr>
+          <w:rFonts w:ascii="Times New Roman" w:hAnsi="Times New Roman"/>
+          <w:b/>
+          <w:szCs w:val="24"/>
+        </w:rPr>
+        <w:t>Mail, telefón:</w:t>
+      </w:r>
+      <w:r>
+        <w:rPr>
+          <w:rFonts w:ascii="Times New Roman" w:hAnsi="Times New Roman"/>
+          <w:szCs w:val="24"/>
+        </w:rPr>
+        <w:t xml:space="preserve">                         {z5_kontakt}</w:t>
+      </w:r>
+    </w:p>
+    <w:p>
+      <w:pPr>
+        <w:pStyle w:val="NoSpacing"/>
+        <w:jc w:val="both"/>
+        <w:rPr/>
+      </w:pPr>
+      <w:r>
+        <w:rPr>
+          <w:rFonts w:ascii="Times New Roman" w:hAnsi="Times New Roman"/>
+          <w:b/>
+          <w:szCs w:val="24"/>
+        </w:rPr>
+        <w:t>Záujemca:</w:t>
+        <w:tab/>
+        <w:tab/>
+        <w:tab/>
+      </w:r>
+      <w:r>
+        <w:rPr>
+          <w:rFonts w:ascii="Times New Roman" w:hAnsi="Times New Roman"/>
+          <w:szCs w:val="24"/>
+        </w:rPr>
+        <w:t>{z6_meno}</w:t>
+      </w:r>
+    </w:p>
+    <w:p>
+      <w:pPr>
+        <w:pStyle w:val="NoSpacing"/>
+        <w:ind w:hanging="2124" w:left="2124"/>
+        <w:jc w:val="both"/>
+        <w:rPr/>
+      </w:pPr>
+      <w:r>
+        <w:rPr>
+          <w:rFonts w:ascii="Times New Roman" w:hAnsi="Times New Roman"/>
+          <w:b/>
+          <w:szCs w:val="24"/>
+        </w:rPr>
+        <w:t>Dátum narodenia:</w:t>
+        <w:tab/>
+        <w:t xml:space="preserve"> </w:t>
+        <w:tab/>
+      </w:r>
+      <w:r>
+        <w:rPr>
+          <w:rFonts w:ascii="Times New Roman" w:hAnsi="Times New Roman"/>
+          <w:szCs w:val="24"/>
+        </w:rPr>
+        <w:t>{z6_datum_nar}</w:t>
+      </w:r>
+    </w:p>
+    <w:p>
+      <w:pPr>
+        <w:pStyle w:val="NoSpacing"/>
+        <w:jc w:val="both"/>
+        <w:rPr/>
+      </w:pPr>
+      <w:r>
+        <w:rPr>
+          <w:rFonts w:ascii="Times New Roman" w:hAnsi="Times New Roman"/>
+          <w:b/>
+          <w:szCs w:val="24"/>
+        </w:rPr>
+        <w:t>Rodné číslo:</w:t>
+        <w:tab/>
+        <w:tab/>
+        <w:tab/>
+      </w:r>
+      <w:r>
+        <w:rPr>
+          <w:rFonts w:ascii="Times New Roman" w:hAnsi="Times New Roman"/>
+          <w:szCs w:val="24"/>
+        </w:rPr>
+        <w:t>{z6_rodne_cislo}</w:t>
+      </w:r>
+    </w:p>
+    <w:p>
+      <w:pPr>
+        <w:pStyle w:val="NoSpacing"/>
+        <w:ind w:hanging="2124" w:left="2124"/>
+        <w:jc w:val="both"/>
+        <w:rPr/>
+      </w:pPr>
+      <w:r>
+        <w:rPr>
+          <w:rFonts w:ascii="Times New Roman" w:hAnsi="Times New Roman"/>
+          <w:b/>
+          <w:szCs w:val="24"/>
+        </w:rPr>
+        <w:t xml:space="preserve">Bytom: </w:t>
+        <w:tab/>
+        <w:t xml:space="preserve"> </w:t>
+        <w:tab/>
+      </w:r>
+      <w:r>
+        <w:rPr>
+          <w:rFonts w:ascii="Times New Roman" w:hAnsi="Times New Roman"/>
+          <w:szCs w:val="24"/>
+        </w:rPr>
+        <w:t>{z6_bytom}</w:t>
+      </w:r>
+    </w:p>
+    <w:p>
+      <w:pPr>
+        <w:pStyle w:val="NoSpacing"/>
+        <w:ind w:hanging="2124" w:left="2124"/>
+        <w:jc w:val="both"/>
+        <w:rPr/>
+      </w:pPr>
+      <w:r>
+        <w:rPr>
+          <w:rFonts w:ascii="Times New Roman" w:hAnsi="Times New Roman"/>
+          <w:b/>
+          <w:szCs w:val="24"/>
+        </w:rPr>
+        <w:t>Mail, telefón:</w:t>
+      </w:r>
+      <w:r>
+        <w:rPr>
+          <w:rFonts w:ascii="Times New Roman" w:hAnsi="Times New Roman"/>
+          <w:szCs w:val="24"/>
+        </w:rPr>
+        <w:t xml:space="preserve">                         {z6_kontakt}</w:t>
       </w:r>
     </w:p>
     <w:p>

</xml_diff>